<commit_message>
Generated demo datasets, product wording, full-width layout, benchmark card fix
Replace the PaySim cuts with a seeded synthetic generator (8M rows with isFraud, 7M without),
raise local upload limits to 12M rows / 1 GB, remove technology and coursework wording from the
interface, widen the layout, fix the speed comparison card staying blank after switching datasets,
and explain the Not scored / Skipped cards.

Co-Authored-By: Claude Sonnet 5.5 <noreply@anthropic.com>
</commit_message>
<xml_diff>
--- a/docs/Viva_Presentation_Guide.docx
+++ b/docs/Viva_Presentation_Guide.docx
@@ -1043,7 +1043,7 @@
               <w:rPr>
                 <w:sz w:val="19"/>
               </w:rPr>
-              <w:t>Pure-Python loops would score 3M rows in minutes; vectorised blocks give 426,000 rows/s. Arrow reads CSV in streaming mode so memory stays flat (534 MB peak for a 3M-row file).</w:t>
+              <w:t>Pure-Python loops would score 3M rows in minutes; vectorised blocks give 426,000 rows/s. Arrow reads CSV in streaming mode so memory does not grow with the file.</w:t>
             </w:r>
           </w:p>
         </w:tc>
@@ -1970,7 +1970,7 @@
               <w:rPr>
                 <w:sz w:val="19"/>
               </w:rPr>
-              <w:t>Upload tab, 'Use sample file' or drop paysim_sample_3_3000000_rows.csv (3 million rows).</w:t>
+              <w:t>Upload tab: drop data/samples/transactions_with_labels_8M.csv (8 million rows, has isFraud). Later the 7M file without isFraud.</w:t>
             </w:r>
           </w:p>
         </w:tc>
@@ -1984,7 +1984,52 @@
               <w:rPr>
                 <w:sz w:val="19"/>
               </w:rPr>
-              <w:t>Streaming upload: the file is read in 16 MB blocks, validated and scored with numpy at about 260,000 rows/s, in about 12 s, with flat memory.</w:t>
+              <w:t>Streaming upload: read in 16 MB blocks, validated and scored with numpy, about 30 s for 8 million rows, then about 40 s to build its own search index. With isFraud the page shows precision and recall; without it, only the model's verdicts.</w:t>
+            </w:r>
+          </w:p>
+        </w:tc>
+      </w:tr>
+      <w:tr>
+        <w:tc>
+          <w:tcPr>
+            <w:tcW w:type="dxa" w:w="1701"/>
+          </w:tcPr>
+          <w:p>
+            <w:r/>
+            <w:r>
+              <w:rPr>
+                <w:b/>
+                <w:sz w:val="19"/>
+              </w:rPr>
+              <w:t>7b. Explain the cards</w:t>
+            </w:r>
+          </w:p>
+        </w:tc>
+        <w:tc>
+          <w:tcPr>
+            <w:tcW w:type="dxa" w:w="3402"/>
+          </w:tcPr>
+          <w:p>
+            <w:r/>
+            <w:r>
+              <w:rPr>
+                <w:sz w:val="19"/>
+              </w:rPr>
+              <w:t>Point at 'Not scored' and 'Skipped (invalid)'.</w:t>
+            </w:r>
+          </w:p>
+        </w:tc>
+        <w:tc>
+          <w:tcPr>
+            <w:tcW w:type="dxa" w:w="4535"/>
+          </w:tcPr>
+          <w:p>
+            <w:r/>
+            <w:r>
+              <w:rPr>
+                <w:sz w:val="19"/>
+              </w:rPr>
+              <w:t>Not scored = PAYMENT, CASH_IN and DEBIT rows: fraud only occurs in transfers and cash-outs, so those rows are kept and searchable but not scored. Skipped = rows with a missing or impossible value such as a negative amount; none here.</w:t>
             </w:r>
           </w:p>
         </w:tc>
@@ -2015,7 +2060,7 @@
               <w:rPr>
                 <w:sz w:val="19"/>
               </w:rPr>
-              <w:t>After upload, the picker at the top shows your file. Open Overview, Explorer and Cases.</w:t>
+              <w:t>After upload, the picker at the top shows your file ('Main ledger' is the 6.36M-row dataset). Open Overview, Explorer and Cases.</w:t>
             </w:r>
           </w:p>
         </w:tc>
@@ -2814,6 +2859,200 @@
           <w:sz w:val="18"/>
         </w:rPr>
         <w:t>venv\Scripts\python -m pytest -q        # 137 passed in about 25 s</w:t>
+      </w:r>
+    </w:p>
+    <w:p>
+      <w:pPr>
+        <w:pStyle w:val="Heading1"/>
+      </w:pPr>
+      <w:r>
+        <w:t>5b. Why synthetic data, and how I made it</w:t>
+      </w:r>
+    </w:p>
+    <w:p>
+      <w:r>
+        <w:rPr>
+          <w:b w:val="0"/>
+          <w:i/>
+        </w:rPr>
+        <w:t>Expect this question. Answer in three parts.</w:t>
+      </w:r>
+    </w:p>
+    <w:p>
+      <w:r>
+        <w:rPr>
+          <w:b/>
+          <w:i w:val="0"/>
+        </w:rPr>
+        <w:t>1. Why synthetic at all</w:t>
+      </w:r>
+    </w:p>
+    <w:p>
+      <w:pPr>
+        <w:pStyle w:val="ListBullet"/>
+      </w:pPr>
+      <w:r>
+        <w:t>Real bank transactions are confidential (customer privacy, banking regulation), and nobody can share them for coursework or put them online.</w:t>
+      </w:r>
+    </w:p>
+    <w:p>
+      <w:pPr>
+        <w:pStyle w:val="ListBullet"/>
+      </w:pPr>
+      <w:r>
+        <w:t>Real fraud labels are rare, late and private. A generator gives ground truth for every row, so accuracy can be measured exactly.</w:t>
+      </w:r>
+    </w:p>
+    <w:p>
+      <w:pPr>
+        <w:pStyle w:val="ListBullet"/>
+      </w:pPr>
+      <w:r>
+        <w:t>I can create any size on demand (6 to 10 million rows) to prove the system scales, and the file is safe to share and upload.</w:t>
+      </w:r>
+    </w:p>
+    <w:p>
+      <w:pPr>
+        <w:pStyle w:val="ListBullet"/>
+      </w:pPr>
+      <w:r>
+        <w:t>The main dataset is also simulated: PaySim was generated by researchers from the logs of a real mobile-money service, because the real logs cannot be published. So both the Main ledger and the upload files are synthetic by necessity; the difference is that PaySim is a published benchmark, and my files are generated separately.</w:t>
+      </w:r>
+    </w:p>
+    <w:p>
+      <w:r>
+        <w:rPr>
+          <w:b/>
+          <w:i w:val="0"/>
+        </w:rPr>
+        <w:t>2. How I made the files (scripts/generate_dataset.py)</w:t>
+      </w:r>
+    </w:p>
+    <w:p>
+      <w:pPr>
+        <w:pStyle w:val="ListBullet"/>
+      </w:pPr>
+      <w:r>
+        <w:rPr>
+          <w:b/>
+        </w:rPr>
+        <w:t xml:space="preserve">Genuine traffic: </w:t>
+      </w:r>
+      <w:r>
+        <w:t>each row draws a type from a fixed mix (CASH_OUT 35%, PAYMENT 34%, CASH_IN 22%, TRANSFER 8.4%, DEBIT 0.6%), an hour from a daily activity curve (quiet at night), and an amount from a log-normal distribution per type (payments small, transfers large). Accounts come from pools of customers and merchants; a few receivers are far more popular. Balances stay consistent: balance after = before minus or plus the amount.</w:t>
+      </w:r>
+    </w:p>
+    <w:p>
+      <w:pPr>
+        <w:pStyle w:val="ListBullet"/>
+      </w:pPr>
+      <w:r>
+        <w:rPr>
+          <w:b/>
+        </w:rPr>
+        <w:t xml:space="preserve">Look-alikes: </w:t>
+      </w:r>
+      <w:r>
+        <w:t>0.4% of genuine transfers and cash-outs empty the sender's account on purpose, so not everything that looks like fraud is fraud.</w:t>
+      </w:r>
+    </w:p>
+    <w:p>
+      <w:pPr>
+        <w:pStyle w:val="ListBullet"/>
+      </w:pPr>
+      <w:r>
+        <w:rPr>
+          <w:b/>
+        </w:rPr>
+        <w:t xml:space="preserve">Fraud events (0.2% of rows): </w:t>
+      </w:r>
+      <w:r>
+        <w:t>account takeover. A victim's whole balance goes to a mule account and is cashed out within the hour. 20% are direct cash-outs, 15% take only part of the balance, and mule accounts are reused.</w:t>
+      </w:r>
+    </w:p>
+    <w:p>
+      <w:pPr>
+        <w:pStyle w:val="ListBullet"/>
+      </w:pPr>
+      <w:r>
+        <w:rPr>
+          <w:b/>
+        </w:rPr>
+        <w:t xml:space="preserve">Output: </w:t>
+      </w:r>
+      <w:r>
+        <w:t>rows ordered by time, same columns as PaySim. With --labels the file has isFraud; without it the column is left out, like a live feed with no verdicts yet.</w:t>
+      </w:r>
+    </w:p>
+    <w:p>
+      <w:pPr>
+        <w:pStyle w:val="ListBullet"/>
+      </w:pPr>
+      <w:r>
+        <w:rPr>
+          <w:b/>
+        </w:rPr>
+        <w:t xml:space="preserve">Reproducible and fast: </w:t>
+      </w:r>
+      <w:r>
+        <w:t>seeded numpy, vectorised; 8 million rows in about 12 seconds. A test (tests/test_generator.py) checks that the same seed gives the same file, balances are consistent and fraud only appears in transfers and cash-outs.</w:t>
+      </w:r>
+    </w:p>
+    <w:p>
+      <w:pPr>
+        <w:ind w:left="283"/>
+        <w:shd w:val="clear" w:color="auto" w:fill="F0F0F0"/>
+      </w:pPr>
+      <w:r>
+        <w:rPr>
+          <w:rFonts w:ascii="Consolas" w:hAnsi="Consolas" w:eastAsia="Consolas"/>
+          <w:sz w:val="18"/>
+        </w:rPr>
+        <w:t>venv\Scripts\python -m scripts.generate_dataset --rows 8000000 --labels --seed 7 --out data/samples/transactions_with_labels_8M.csv</w:t>
+        <w:br/>
+        <w:t>venv\Scripts\python -m scripts.generate_dataset --rows 7000000 --seed 11 --out data/samples/transactions_without_labels_7M.csv</w:t>
+      </w:r>
+    </w:p>
+    <w:p>
+      <w:r>
+        <w:rPr>
+          <w:b/>
+          <w:i w:val="0"/>
+        </w:rPr>
+        <w:t>3. Be honest about the limits</w:t>
+      </w:r>
+    </w:p>
+    <w:p>
+      <w:pPr>
+        <w:pStyle w:val="ListBullet"/>
+      </w:pPr>
+      <w:r>
+        <w:t>The fraud pattern in my generator is my own assumption (account takeover). Real fraud is more varied, so these numbers are not a claim about real banks.</w:t>
+      </w:r>
+    </w:p>
+    <w:p>
+      <w:pPr>
+        <w:pStyle w:val="ListBullet"/>
+      </w:pPr>
+      <w:r>
+        <w:t>I borrowed only the shape of PaySim (type mix, orders of magnitude), no PaySim rows. The model was trained on PaySim only, so on my generated files it is tested on data it never saw: precision 51.8% and recall 92.1% on the 8M file. That is lower than on PaySim (99.3% / 99.75%), which is the honest result of moving to a different dataset.</w:t>
+      </w:r>
+    </w:p>
+    <w:p>
+      <w:pPr>
+        <w:pStyle w:val="ListBullet"/>
+      </w:pPr>
+      <w:r>
+        <w:t>What the generated files prove is scale and engineering (streaming, indexing, search, cases on millions of rows), not detection quality in the real world.</w:t>
+      </w:r>
+    </w:p>
+    <w:p>
+      <w:r>
+        <w:rPr>
+          <w:b w:val="0"/>
+          <w:i/>
+        </w:rPr>
+        <w:t>Two files, two purposes: the file WITH isFraud lets the page measure accuracy (confusion matrix, precision, recall); the file WITHOUT it behaves like real production data where verdicts do not exist yet, and the page shows only the model's flags.</w:t>
       </w:r>
     </w:p>
     <w:p>
@@ -4976,7 +5215,7 @@
                 <w:b/>
                 <w:sz w:val="19"/>
               </w:rPr>
-              <w:t>Upload speed</w:t>
+              <w:t>Upload speed (generated files)</w:t>
             </w:r>
           </w:p>
         </w:tc>
@@ -4990,7 +5229,38 @@
               <w:rPr>
                 <w:sz w:val="19"/>
               </w:rPr>
-              <w:t>1.2M rows 7.4 s, 2M rows 8.5 s, 3M rows 12.5 s (about 260,000 rows/s); plus about 14 s to index a 3M-row file; server memory peak 534 MB</w:t>
+              <w:t>8.0M rows (565 MB, labelled): about 30 s scoring + about 42 s indexing. 7.0M rows (481 MB, unlabelled): about 35 s + about 38 s. Doing both at once roughly doubles each.</w:t>
+            </w:r>
+          </w:p>
+        </w:tc>
+      </w:tr>
+      <w:tr>
+        <w:tc>
+          <w:tcPr>
+            <w:tcW w:type="dxa" w:w="3402"/>
+          </w:tcPr>
+          <w:p>
+            <w:r/>
+            <w:r>
+              <w:rPr>
+                <w:b/>
+                <w:sz w:val="19"/>
+              </w:rPr>
+              <w:t>Model on the unseen 8M file</w:t>
+            </w:r>
+          </w:p>
+        </w:tc>
+        <w:tc>
+          <w:tcPr>
+            <w:tcW w:type="dxa" w:w="6236"/>
+          </w:tcPr>
+          <w:p>
+            <w:r/>
+            <w:r>
+              <w:rPr>
+                <w:sz w:val="19"/>
+              </w:rPr>
+              <w:t>precision 51.8%, recall 92.1%, F1 66.4% (28,561 flagged, 14,807 true frauds caught, 1,265 missed). Lower than on PaySim because the file is a different dataset the model never saw.</w:t>
             </w:r>
           </w:p>
         </w:tc>
@@ -5096,6 +5366,45 @@
       </w:pPr>
       <w:r>
         <w:t>10. Likely questions and good answers</w:t>
+      </w:r>
+    </w:p>
+    <w:p>
+      <w:r>
+        <w:rPr>
+          <w:b/>
+        </w:rPr>
+        <w:t>Q: Why did you use synthetic data? How did you make it?</w:t>
+      </w:r>
+    </w:p>
+    <w:p>
+      <w:r>
+        <w:t>A: Real bank data is confidential and fraud labels are rarely shared, so the main dataset is PaySim, a published simulation of a real mobile-money service. For the upload demos I wrote my own generator (scripts/generate_dataset.py): seeded numpy that draws type, hour and log-normal amount per type, keeps balances consistent, adds look-alike genuine rows and injects account-takeover fraud (about 0.2% of rows, a victim's balance moved to a reused mule account and cashed out). I made two files, 8M rows with isFraud and 7M without, to show both a measurable file and a production-like feed. It proves scale and engineering, not real-world detection quality.</w:t>
+      </w:r>
+    </w:p>
+    <w:p>
+      <w:r>
+        <w:rPr>
+          <w:b/>
+        </w:rPr>
+        <w:t>Q: Why is accuracy lower on your uploaded file than on the main dataset?</w:t>
+      </w:r>
+    </w:p>
+    <w:p>
+      <w:r>
+        <w:t>A: The model was trained on PaySim only. My generated file is a different dataset with its own fraud pattern and look-alike rows, so precision is 51.8% (recall still 92.1%). That is the honest result of testing on data the model never saw.</w:t>
+      </w:r>
+    </w:p>
+    <w:p>
+      <w:r>
+        <w:rPr>
+          <w:b/>
+        </w:rPr>
+        <w:t>Q: What do 'Not scored' and 'Skipped' mean?</w:t>
+      </w:r>
+    </w:p>
+    <w:p>
+      <w:r>
+        <w:t>A: Not scored: PAYMENT, CASH_IN and DEBIT rows. Fraud only occurs in TRANSFER and CASH_OUT, so the model is built for those two; the rest stay in the file and in search. Skipped: rows with a missing or impossible value (negative amount, unknown type, empty account); they are listed with their row numbers and do not stop the upload.</w:t>
       </w:r>
     </w:p>
     <w:p>
@@ -5317,7 +5626,7 @@
         <w:pStyle w:val="ListBullet"/>
       </w:pPr>
       <w:r>
-        <w:t>Have the 3 big CSVs ready in data\samples\ (recreate with: python -m scripts.make_big_samples).</w:t>
+        <w:t>Have the two big CSVs ready in data\samples\ (recreate with python -m scripts.generate_dataset, see section 5b).</w:t>
       </w:r>
     </w:p>
     <w:p>

</xml_diff>

<commit_message>
Remove the search speed comparison card from the Explorer
Co-Authored-By: Claude Sonnet 5.5 <noreply@anthropic.com>
</commit_message>
<xml_diff>
--- a/docs/Viva_Presentation_Guide.docx
+++ b/docs/Viva_Presentation_Guide.docx
@@ -1804,7 +1804,7 @@
               <w:rPr>
                 <w:sz w:val="19"/>
               </w:rPr>
-              <w:t>6.36M rows searched in about 5 ms server time. Next slide shows the comparison with Spark's 1.4 seconds.</w:t>
+              <w:t>6.36M rows searched in about 5 ms server time. A full Spark scan of the same data takes 1.4 seconds.</w:t>
             </w:r>
           </w:p>
         </w:tc>
@@ -1821,7 +1821,7 @@
                 <w:b/>
                 <w:sz w:val="19"/>
               </w:rPr>
-              <w:t>4. Benchmark card</w:t>
+              <w:t>4. Why it is fast</w:t>
             </w:r>
           </w:p>
         </w:tc>
@@ -1835,7 +1835,7 @@
               <w:rPr>
                 <w:sz w:val="19"/>
               </w:rPr>
-              <w:t>Show the benchmark table in the Explorer.</w:t>
+              <w:t>Say it; the numbers are in the README and results/search_benchmark.json (rerun: python -m scripts.benchmark_search).</w:t>
             </w:r>
           </w:p>
         </w:tc>
@@ -1849,7 +1849,7 @@
               <w:rPr>
                 <w:sz w:val="19"/>
               </w:rPr>
-              <w:t>Same query on four engines: Spark 1,441 ms, DuckDB on Parquet 276 ms, DuckDB table without index 28 ms, with index 2.5 ms. 574x faster than Spark. Spark is for batch, an index for lookups.</w:t>
+              <w:t>Same lookup on four engines: Spark 1,441 ms, DuckDB on Parquet 276 ms, DuckDB table without index 28 ms, with index 2.5 ms. 574x faster than Spark. Spark is for batch, an index for lookups.</w:t>
             </w:r>
           </w:p>
         </w:tc>

</xml_diff>